<commit_message>
docs: short README, architecture diagram, verified reference and guides
- README: what the lab is, the architecture (light/dark SVG), and three
  quick-start paths: .env, 1Password, or the setup wizard.
- docs/REFERENCE.md rewritten against the running stack: services, ports,
  networks, profiles, secrets, seeding for every builder, troubleshooting.
- Guides checked against a live run and their .docx copies regenerated;
  the Lakera guide becomes the Lakera Guard screening agent guide.
- Remove stale screenshots, the old demo GIF and implementation_plan.md.

Co-Authored-By: Claude Opus 5.5 <noreply@anthropic.com>
</commit_message>
<xml_diff>
--- a/docs/guides/CPInfo_Analysis_MCP_Agent_Guide.docx
+++ b/docs/guides/CPInfo_Analysis_MCP_Agent_Guide.docx
@@ -7,12 +7,50 @@
         <w:pStyle w:val="Heading1"/>
       </w:pPr>
       <w:r>
-        <w:t>CPInfo Analysis MCP Agent Guide</w:t>
+        <w:t>CPInfo Analysis Agents (MCP Gateway and Direct)</w:t>
       </w:r>
     </w:p>
     <w:p>
       <w:r>
-        <w:t>This guide details the **CPInfo Analysis MCP Agent** workflow, designed to analyze Check Point CPInfo files using AI and the Model Context Protocol (MCP).</w:t>
+        <w:t>The CPInfo Analysis agents analyze CPInfo diagnostic files: system details, licenses, health, crashes,</w:t>
+      </w:r>
+    </w:p>
+    <w:p>
+      <w:r>
+        <w:t>performance, and network configuration. They point at anomalies worth a closer look and suggest the next</w:t>
+      </w:r>
+    </w:p>
+    <w:p>
+      <w:r>
+        <w:t>diagnostic steps. The server reads files only; it needs no Check Point credentials.</w:t>
+      </w:r>
+    </w:p>
+    <w:p>
+      <w:r>
+        <w:t xml:space="preserve">Two agents ship in n8n, Flowise, and Langflow: </w:t>
+      </w:r>
+      <w:r>
+        <w:rPr>
+          <w:b/>
+        </w:rPr>
+        <w:t>CPInfo Analysis Agent (MCP Gateway)</w:t>
+      </w:r>
+      <w:r>
+        <w:t xml:space="preserve"> and </w:t>
+      </w:r>
+      <w:r>
+        <w:rPr>
+          <w:b/>
+        </w:rPr>
+        <w:t>CPInfo Analysis Agent (Direct)</w:t>
+      </w:r>
+      <w:r>
+        <w:t>. They have the same 12 tools and the same prompt. Only the path of the tool calls differs.</w:t>
+      </w:r>
+    </w:p>
+    <w:p>
+      <w:r>
+        <w:t>Every tool of these agents only reads. The agents never change a file or your environment.</w:t>
       </w:r>
     </w:p>
     <w:p>
@@ -20,12 +58,210 @@
         <w:pStyle w:val="Heading2"/>
       </w:pPr>
       <w:r>
-        <w:t>Overview</w:t>
+        <w:t>At a glance</w:t>
       </w:r>
     </w:p>
     <w:p>
       <w:r>
-        <w:t>The **CPInfo Analysis MCP Agent** is an intelligent automation workflow that interacts with Check Point CPInfo files. It utilizes an LLM (Large Language Model) to interpret user requests and execute analysis tools.</w:t>
+        <w:t>|  | MCP Gateway agent | Direct agent |</w:t>
+      </w:r>
+    </w:p>
+    <w:p>
+      <w:r>
+        <w:t>| Agent name | CPInfo Analysis Agent (MCP Gateway) | CPInfo Analysis Agent (Direct) |</w:t>
+      </w:r>
+    </w:p>
+    <w:p>
+      <w:r>
+        <w:t xml:space="preserve">| Endpoint | </w:t>
+      </w:r>
+      <w:r>
+        <w:rPr>
+          <w:rFonts w:ascii="Courier New" w:hAnsi="Courier New"/>
+        </w:rPr>
+        <w:t>http://mcp-gateway:8080/mcp</w:t>
+      </w:r>
+      <w:r>
+        <w:t xml:space="preserve">, Bearer token </w:t>
+      </w:r>
+      <w:r>
+        <w:rPr>
+          <w:rFonts w:ascii="Courier New" w:hAnsi="Courier New"/>
+        </w:rPr>
+        <w:t>MCP_GATEWAY_TOKEN</w:t>
+      </w:r>
+      <w:r>
+        <w:t xml:space="preserve"> | </w:t>
+      </w:r>
+      <w:r>
+        <w:rPr>
+          <w:rFonts w:ascii="Courier New" w:hAnsi="Courier New"/>
+        </w:rPr>
+        <w:t>http://cpinfo-analysis-mcp:3012</w:t>
+      </w:r>
+      <w:r>
+        <w:t xml:space="preserve">, no token (internal </w:t>
+      </w:r>
+      <w:r>
+        <w:rPr>
+          <w:rFonts w:ascii="Courier New" w:hAnsi="Courier New"/>
+        </w:rPr>
+        <w:t>lab</w:t>
+      </w:r>
+      <w:r>
+        <w:t xml:space="preserve"> network only) |</w:t>
+      </w:r>
+    </w:p>
+    <w:p>
+      <w:r>
+        <w:t>| Tools | 12 of the gateway's 190, selected | All 12 of the server |</w:t>
+      </w:r>
+    </w:p>
+    <w:p>
+      <w:r>
+        <w:t xml:space="preserve">| n8n MCP Client Tool node | </w:t>
+      </w:r>
+      <w:r>
+        <w:rPr>
+          <w:rFonts w:ascii="Courier New" w:hAnsi="Courier New"/>
+        </w:rPr>
+        <w:t>MCP Gateway</w:t>
+      </w:r>
+      <w:r>
+        <w:t xml:space="preserve"> | </w:t>
+      </w:r>
+      <w:r>
+        <w:rPr>
+          <w:rFonts w:ascii="Courier New" w:hAnsi="Courier New"/>
+        </w:rPr>
+        <w:t>CPInfo Analysis MCP</w:t>
+      </w:r>
+      <w:r>
+        <w:t xml:space="preserve"> |</w:t>
+      </w:r>
+    </w:p>
+    <w:p>
+      <w:r>
+        <w:t xml:space="preserve">| Tool names the model sees in n8n | </w:t>
+      </w:r>
+      <w:r>
+        <w:rPr>
+          <w:rFonts w:ascii="Courier New" w:hAnsi="Courier New"/>
+        </w:rPr>
+        <w:t>MCP_Gateway_check_initialization_status</w:t>
+      </w:r>
+      <w:r>
+        <w:t xml:space="preserve"> | </w:t>
+      </w:r>
+      <w:r>
+        <w:rPr>
+          <w:rFonts w:ascii="Courier New" w:hAnsi="Courier New"/>
+        </w:rPr>
+        <w:t>CPInfo_Analysis_MCP_check_initialization_status</w:t>
+      </w:r>
+      <w:r>
+        <w:t xml:space="preserve"> |</w:t>
+      </w:r>
+    </w:p>
+    <w:p>
+      <w:r>
+        <w:t xml:space="preserve">| n8n workflow file | </w:t>
+      </w:r>
+      <w:r>
+        <w:rPr>
+          <w:rFonts w:ascii="Courier New" w:hAnsi="Courier New"/>
+        </w:rPr>
+        <w:t>n8n/backup/workflows/cpinfo-analysis-via-gateway.json</w:t>
+      </w:r>
+      <w:r>
+        <w:t xml:space="preserve"> | </w:t>
+      </w:r>
+      <w:r>
+        <w:rPr>
+          <w:rFonts w:ascii="Courier New" w:hAnsi="Courier New"/>
+        </w:rPr>
+        <w:t>n8n/backup/workflows/cp-cpinfo-analysis-mcp-agent.json</w:t>
+      </w:r>
+      <w:r>
+        <w:t xml:space="preserve"> |</w:t>
+      </w:r>
+    </w:p>
+    <w:p>
+      <w:r>
+        <w:t xml:space="preserve">| Flowise file | </w:t>
+      </w:r>
+      <w:r>
+        <w:rPr>
+          <w:rFonts w:ascii="Courier New" w:hAnsi="Courier New"/>
+        </w:rPr>
+        <w:t>integrations/flowise/cpinfo-analysis.flowdata.json</w:t>
+      </w:r>
+      <w:r>
+        <w:t xml:space="preserve"> | </w:t>
+      </w:r>
+      <w:r>
+        <w:rPr>
+          <w:rFonts w:ascii="Courier New" w:hAnsi="Courier New"/>
+        </w:rPr>
+        <w:t>integrations/flowise/direct-cpinfo.flowdata.json</w:t>
+      </w:r>
+      <w:r>
+        <w:t xml:space="preserve"> |</w:t>
+      </w:r>
+    </w:p>
+    <w:p>
+      <w:r>
+        <w:t xml:space="preserve">| Langflow file | </w:t>
+      </w:r>
+      <w:r>
+        <w:rPr>
+          <w:rFonts w:ascii="Courier New" w:hAnsi="Courier New"/>
+        </w:rPr>
+        <w:t>integrations/langflow/cpinfo-analysis.flow.json</w:t>
+      </w:r>
+      <w:r>
+        <w:t xml:space="preserve"> | </w:t>
+      </w:r>
+      <w:r>
+        <w:rPr>
+          <w:rFonts w:ascii="Courier New" w:hAnsi="Courier New"/>
+        </w:rPr>
+        <w:t>integrations/langflow/direct-cpinfo.flow.json</w:t>
+      </w:r>
+      <w:r>
+        <w:t xml:space="preserve"> |</w:t>
+      </w:r>
+    </w:p>
+    <w:p>
+      <w:r>
+        <w:t xml:space="preserve">The MCP server runs as the Compose service </w:t>
+      </w:r>
+      <w:r>
+        <w:rPr>
+          <w:rFonts w:ascii="Courier New" w:hAnsi="Courier New"/>
+        </w:rPr>
+        <w:t>cpinfo-analysis-mcp</w:t>
+      </w:r>
+      <w:r>
+        <w:t xml:space="preserve"> (catalog key </w:t>
+      </w:r>
+      <w:r>
+        <w:rPr>
+          <w:rFonts w:ascii="Courier New" w:hAnsi="Courier New"/>
+        </w:rPr>
+        <w:t>cpinfo-analysis</w:t>
+      </w:r>
+      <w:r>
+        <w:t xml:space="preserve"> in </w:t>
+      </w:r>
+      <w:r>
+        <w:rPr>
+          <w:rFonts w:ascii="Courier New" w:hAnsi="Courier New"/>
+        </w:rPr>
+        <w:t>mcp-gateway/catalog.yaml</w:t>
+      </w:r>
+      <w:r>
+        <w:t>).</w:t>
       </w:r>
     </w:p>
     <w:p>
@@ -33,7 +269,7 @@
         <w:pStyle w:val="Heading2"/>
       </w:pPr>
       <w:r>
-        <w:t>Prerequisites</w:t>
+        <w:t>Tools (12)</w:t>
       </w:r>
     </w:p>
     <w:p>
@@ -41,7 +277,46 @@
         <w:pStyle w:val="ListBullet"/>
       </w:pPr>
       <w:r>
-        <w:t xml:space="preserve">  **n8n URL**: `http://&lt;host_ip&gt;:5678`</w:t>
+        <w:rPr>
+          <w:b/>
+        </w:rPr>
+        <w:t>Files:</w:t>
+      </w:r>
+      <w:r>
+        <w:t xml:space="preserve"> </w:t>
+      </w:r>
+      <w:r>
+        <w:rPr>
+          <w:rFonts w:ascii="Courier New" w:hAnsi="Courier New"/>
+        </w:rPr>
+        <w:t>check_initialization_status</w:t>
+      </w:r>
+      <w:r>
+        <w:t xml:space="preserve">, </w:t>
+      </w:r>
+      <w:r>
+        <w:rPr>
+          <w:rFonts w:ascii="Courier New" w:hAnsi="Courier New"/>
+        </w:rPr>
+        <w:t>browse_sections_by_category</w:t>
+      </w:r>
+      <w:r>
+        <w:t xml:space="preserve">, </w:t>
+      </w:r>
+      <w:r>
+        <w:rPr>
+          <w:rFonts w:ascii="Courier New" w:hAnsi="Courier New"/>
+        </w:rPr>
+        <w:t>read_section_content</w:t>
+      </w:r>
+      <w:r>
+        <w:t xml:space="preserve">, </w:t>
+      </w:r>
+      <w:r>
+        <w:rPr>
+          <w:rFonts w:ascii="Courier New" w:hAnsi="Courier New"/>
+        </w:rPr>
+        <w:t>smart_content_search</w:t>
       </w:r>
     </w:p>
     <w:p>
@@ -49,7 +324,744 @@
         <w:pStyle w:val="ListBullet"/>
       </w:pPr>
       <w:r>
-        <w:t xml:space="preserve">  **Credentials**:</w:t>
+        <w:rPr>
+          <w:b/>
+        </w:rPr>
+        <w:t>Analysis:</w:t>
+      </w:r>
+      <w:r>
+        <w:t xml:space="preserve"> </w:t>
+      </w:r>
+      <w:r>
+        <w:rPr>
+          <w:rFonts w:ascii="Courier New" w:hAnsi="Courier New"/>
+        </w:rPr>
+        <w:t>analyze_cpinfo_overview</w:t>
+      </w:r>
+      <w:r>
+        <w:t xml:space="preserve">, </w:t>
+      </w:r>
+      <w:r>
+        <w:rPr>
+          <w:rFonts w:ascii="Courier New" w:hAnsi="Courier New"/>
+        </w:rPr>
+        <w:t>comprehensive_health_analysis</w:t>
+      </w:r>
+      <w:r>
+        <w:t xml:space="preserve">, </w:t>
+      </w:r>
+      <w:r>
+        <w:rPr>
+          <w:rFonts w:ascii="Courier New" w:hAnsi="Courier New"/>
+        </w:rPr>
+        <w:t>extract_system_details</w:t>
+      </w:r>
+      <w:r>
+        <w:t xml:space="preserve">, </w:t>
+      </w:r>
+      <w:r>
+        <w:rPr>
+          <w:rFonts w:ascii="Courier New" w:hAnsi="Courier New"/>
+        </w:rPr>
+        <w:t>extract_license_information</w:t>
+      </w:r>
+      <w:r>
+        <w:t xml:space="preserve">, </w:t>
+      </w:r>
+      <w:r>
+        <w:rPr>
+          <w:rFonts w:ascii="Courier New" w:hAnsi="Courier New"/>
+        </w:rPr>
+        <w:t>extract_network_config</w:t>
+      </w:r>
+      <w:r>
+        <w:t xml:space="preserve">, </w:t>
+      </w:r>
+      <w:r>
+        <w:rPr>
+          <w:rFonts w:ascii="Courier New" w:hAnsi="Courier New"/>
+        </w:rPr>
+        <w:t>analyze_performance_metrics</w:t>
+      </w:r>
+      <w:r>
+        <w:t xml:space="preserve">, </w:t>
+      </w:r>
+      <w:r>
+        <w:rPr>
+          <w:rFonts w:ascii="Courier New" w:hAnsi="Courier New"/>
+        </w:rPr>
+        <w:t>audit_security_settings</w:t>
+      </w:r>
+      <w:r>
+        <w:t xml:space="preserve">, </w:t>
+      </w:r>
+      <w:r>
+        <w:rPr>
+          <w:rFonts w:ascii="Courier New" w:hAnsi="Courier New"/>
+        </w:rPr>
+        <w:t>detect_system_crashes</w:t>
+      </w:r>
+    </w:p>
+    <w:p>
+      <w:pPr>
+        <w:pStyle w:val="Heading2"/>
+      </w:pPr>
+      <w:r>
+        <w:t>Prerequisites</w:t>
+      </w:r>
+    </w:p>
+    <w:p>
+      <w:pPr>
+        <w:pStyle w:val="ListNumber"/>
+      </w:pPr>
+      <w:r>
+        <w:rPr>
+          <w:b/>
+        </w:rPr>
+        <w:t>The lab is running.</w:t>
+      </w:r>
+      <w:r>
+        <w:t xml:space="preserve"> </w:t>
+      </w:r>
+      <w:r>
+        <w:rPr>
+          <w:rFonts w:ascii="Courier New" w:hAnsi="Courier New"/>
+        </w:rPr>
+        <w:t>./scripts/doctor.sh --post-start</w:t>
+      </w:r>
+      <w:r>
+        <w:t xml:space="preserve"> reports </w:t>
+      </w:r>
+      <w:r>
+        <w:rPr>
+          <w:rFonts w:ascii="Courier New" w:hAnsi="Courier New"/>
+        </w:rPr>
+        <w:t>no blockers</w:t>
+      </w:r>
+      <w:r>
+        <w:t xml:space="preserve"> (with 1Password references in </w:t>
+      </w:r>
+      <w:r>
+        <w:rPr>
+          <w:rFonts w:ascii="Courier New" w:hAnsi="Courier New"/>
+        </w:rPr>
+        <w:t>.env</w:t>
+      </w:r>
+      <w:r>
+        <w:t xml:space="preserve">: </w:t>
+      </w:r>
+      <w:r>
+        <w:rPr>
+          <w:rFonts w:ascii="Courier New" w:hAnsi="Courier New"/>
+        </w:rPr>
+        <w:t>op run --env-file=.env -- ./scripts/doctor.sh --post-start</w:t>
+      </w:r>
+      <w:r>
+        <w:t>)</w:t>
+      </w:r>
+    </w:p>
+    <w:p>
+      <w:pPr>
+        <w:pStyle w:val="ListNumber"/>
+      </w:pPr>
+      <w:r>
+        <w:rPr>
+          <w:b/>
+        </w:rPr>
+        <w:t>A model for `lab-chat`.</w:t>
+      </w:r>
+      <w:r>
+        <w:t xml:space="preserve"> One model provider key in </w:t>
+      </w:r>
+      <w:r>
+        <w:rPr>
+          <w:rFonts w:ascii="Courier New" w:hAnsi="Courier New"/>
+        </w:rPr>
+        <w:t>.env</w:t>
+      </w:r>
+      <w:r>
+        <w:t xml:space="preserve">, or the local Ollama model (slow on a CPU). Every agent calls </w:t>
+      </w:r>
+      <w:r>
+        <w:rPr>
+          <w:rFonts w:ascii="Courier New" w:hAnsi="Courier New"/>
+        </w:rPr>
+        <w:t>lab-chat</w:t>
+      </w:r>
+      <w:r>
+        <w:t xml:space="preserve"> through LiteLLM; builders never hold provider keys</w:t>
+      </w:r>
+    </w:p>
+    <w:p>
+      <w:pPr>
+        <w:pStyle w:val="ListNumber"/>
+      </w:pPr>
+      <w:r>
+        <w:rPr>
+          <w:b/>
+        </w:rPr>
+        <w:t>A CPInfo file</w:t>
+      </w:r>
+      <w:r>
+        <w:t xml:space="preserve"> (table below). The server needs no Check Point credentials, and </w:t>
+      </w:r>
+      <w:r>
+        <w:rPr>
+          <w:rFonts w:ascii="Courier New" w:hAnsi="Courier New"/>
+        </w:rPr>
+        <w:t>./setup.sh</w:t>
+      </w:r>
+      <w:r>
+        <w:t xml:space="preserve"> asks nothing for it. With 1Password references in </w:t>
+      </w:r>
+      <w:r>
+        <w:rPr>
+          <w:rFonts w:ascii="Courier New" w:hAnsi="Courier New"/>
+        </w:rPr>
+        <w:t>.env</w:t>
+      </w:r>
+      <w:r>
+        <w:t xml:space="preserve">, start every </w:t>
+      </w:r>
+      <w:r>
+        <w:rPr>
+          <w:rFonts w:ascii="Courier New" w:hAnsi="Courier New"/>
+        </w:rPr>
+        <w:t>docker compose</w:t>
+      </w:r>
+      <w:r>
+        <w:t xml:space="preserve"> command in this guide with </w:t>
+      </w:r>
+      <w:r>
+        <w:rPr>
+          <w:rFonts w:ascii="Courier New" w:hAnsi="Courier New"/>
+        </w:rPr>
+        <w:t>op run --env-file=.env --</w:t>
+      </w:r>
+      <w:r>
+        <w:t xml:space="preserve"> (</w:t>
+      </w:r>
+      <w:r>
+        <w:t>Secrets and 1Password</w:t>
+      </w:r>
+      <w:r>
+        <w:t xml:space="preserve"> (../REFERENCE.md#secrets-and-1password)</w:t>
+      </w:r>
+      <w:r>
+        <w:t>)</w:t>
+      </w:r>
+    </w:p>
+    <w:p>
+      <w:pPr>
+        <w:pStyle w:val="ListNumber"/>
+      </w:pPr>
+      <w:r>
+        <w:rPr>
+          <w:b/>
+        </w:rPr>
+        <w:t>Sign-in.</w:t>
+      </w:r>
+      <w:r>
+        <w:t xml:space="preserve"> The lab admin for n8n, Flowise, and Langflow: </w:t>
+      </w:r>
+      <w:r>
+        <w:rPr>
+          <w:rFonts w:ascii="Courier New" w:hAnsi="Courier New"/>
+        </w:rPr>
+        <w:t>N8N_ADMIN_EMAIL</w:t>
+      </w:r>
+      <w:r>
+        <w:t xml:space="preserve"> (default </w:t>
+      </w:r>
+      <w:r>
+        <w:rPr>
+          <w:rFonts w:ascii="Courier New" w:hAnsi="Courier New"/>
+        </w:rPr>
+        <w:t>admin@lab.local</w:t>
+      </w:r>
+      <w:r>
+        <w:t xml:space="preserve">) and </w:t>
+      </w:r>
+      <w:r>
+        <w:rPr>
+          <w:rFonts w:ascii="Courier New" w:hAnsi="Courier New"/>
+        </w:rPr>
+        <w:t>N8N_ADMIN_PASSWORD</w:t>
+      </w:r>
+    </w:p>
+    <w:p>
+      <w:r>
+        <w:t>| Setting | Value |</w:t>
+      </w:r>
+    </w:p>
+    <w:p>
+      <w:r>
+        <w:t xml:space="preserve">| A CPInfo file | Copy it into the folder </w:t>
+      </w:r>
+      <w:r>
+        <w:rPr>
+          <w:rFonts w:ascii="Courier New" w:hAnsi="Courier New"/>
+        </w:rPr>
+        <w:t>n8n/shared</w:t>
+      </w:r>
+      <w:r>
+        <w:t xml:space="preserve"> next to </w:t>
+      </w:r>
+      <w:r>
+        <w:rPr>
+          <w:rFonts w:ascii="Courier New" w:hAnsi="Courier New"/>
+        </w:rPr>
+        <w:t>docker-compose.yml</w:t>
+      </w:r>
+      <w:r>
+        <w:t xml:space="preserve"> (Docker creates it at the first start). The server sees that folder as </w:t>
+      </w:r>
+      <w:r>
+        <w:rPr>
+          <w:rFonts w:ascii="Courier New" w:hAnsi="Courier New"/>
+        </w:rPr>
+        <w:t>/data/cpinfo</w:t>
+      </w:r>
+      <w:r>
+        <w:t>. No restart is needed. |</w:t>
+      </w:r>
+    </w:p>
+    <w:p>
+      <w:r>
+        <w:t xml:space="preserve">| </w:t>
+      </w:r>
+      <w:r>
+        <w:rPr>
+          <w:rFonts w:ascii="Courier New" w:hAnsi="Courier New"/>
+        </w:rPr>
+        <w:t>CPINFO_LOG_LEVEL</w:t>
+      </w:r>
+      <w:r>
+        <w:t xml:space="preserve"> | Optional. Log level of the server. Default </w:t>
+      </w:r>
+      <w:r>
+        <w:rPr>
+          <w:rFonts w:ascii="Courier New" w:hAnsi="Courier New"/>
+        </w:rPr>
+        <w:t>info</w:t>
+      </w:r>
+      <w:r>
+        <w:t>. |</w:t>
+      </w:r>
+    </w:p>
+    <w:p>
+      <w:r>
+        <w:t xml:space="preserve">The server opens only regular files under </w:t>
+      </w:r>
+      <w:r>
+        <w:rPr>
+          <w:rFonts w:ascii="Courier New" w:hAnsi="Courier New"/>
+        </w:rPr>
+        <w:t>/data/cpinfo</w:t>
+      </w:r>
+      <w:r>
+        <w:t xml:space="preserve"> (its </w:t>
+      </w:r>
+      <w:r>
+        <w:rPr>
+          <w:rFonts w:ascii="Courier New" w:hAnsi="Courier New"/>
+        </w:rPr>
+        <w:t>CPINFO_ALLOWED_DIRS</w:t>
+      </w:r>
+      <w:r>
+        <w:t xml:space="preserve"> default). A plain file</w:t>
+      </w:r>
+    </w:p>
+    <w:p>
+      <w:r>
+        <w:t xml:space="preserve">name is resolved against that folder. Symbolic links and </w:t>
+      </w:r>
+      <w:r>
+        <w:rPr>
+          <w:rFonts w:ascii="Courier New" w:hAnsi="Courier New"/>
+        </w:rPr>
+        <w:t>..</w:t>
+      </w:r>
+      <w:r>
+        <w:t xml:space="preserve"> are resolved first, so they cannot reach</w:t>
+      </w:r>
+    </w:p>
+    <w:p>
+      <w:r>
+        <w:t>other folders.</w:t>
+      </w:r>
+    </w:p>
+    <w:p>
+      <w:pPr>
+        <w:pStyle w:val="Heading2"/>
+      </w:pPr>
+      <w:r>
+        <w:t>Chat with the agents</w:t>
+      </w:r>
+    </w:p>
+    <w:p>
+      <w:pPr>
+        <w:pStyle w:val="Heading3"/>
+      </w:pPr>
+      <w:r>
+        <w:t>n8n</w:t>
+      </w:r>
+    </w:p>
+    <w:p>
+      <w:pPr>
+        <w:pStyle w:val="ListNumber"/>
+      </w:pPr>
+      <w:r>
+        <w:t xml:space="preserve">Sign in to n8n and open the workflow </w:t>
+      </w:r>
+      <w:r>
+        <w:rPr>
+          <w:b/>
+        </w:rPr>
+        <w:t>CPInfo Analysis Agent (Direct)</w:t>
+      </w:r>
+    </w:p>
+    <w:p>
+      <w:pPr>
+        <w:pStyle w:val="ListNumber"/>
+      </w:pPr>
+      <w:r>
+        <w:t xml:space="preserve">Click </w:t>
+      </w:r>
+      <w:r>
+        <w:rPr>
+          <w:b/>
+        </w:rPr>
+        <w:t>Open chat</w:t>
+      </w:r>
+      <w:r>
+        <w:t xml:space="preserve"> and send one of the prompts below</w:t>
+      </w:r>
+    </w:p>
+    <w:p>
+      <w:pPr>
+        <w:pStyle w:val="ListNumber"/>
+      </w:pPr>
+      <w:r>
+        <w:t xml:space="preserve">Open the </w:t>
+      </w:r>
+      <w:r>
+        <w:rPr>
+          <w:b/>
+        </w:rPr>
+        <w:t>Executions</w:t>
+      </w:r>
+      <w:r>
+        <w:t xml:space="preserve"> tab and the latest run. The MCP Client Tool </w:t>
+      </w:r>
+      <w:r>
+        <w:rPr>
+          <w:b/>
+        </w:rPr>
+        <w:t>CPInfo Analysis MCP</w:t>
+      </w:r>
+      <w:r>
+        <w:t xml:space="preserve"> shows the tools the agent called, for example </w:t>
+      </w:r>
+      <w:r>
+        <w:rPr>
+          <w:rFonts w:ascii="Courier New" w:hAnsi="Courier New"/>
+        </w:rPr>
+        <w:t>CPInfo_Analysis_MCP_check_initialization_status</w:t>
+      </w:r>
+    </w:p>
+    <w:p>
+      <w:pPr>
+        <w:pStyle w:val="ListNumber"/>
+      </w:pPr>
+      <w:r>
+        <w:t xml:space="preserve">Repeat with </w:t>
+      </w:r>
+      <w:r>
+        <w:rPr>
+          <w:b/>
+        </w:rPr>
+        <w:t>CPInfo Analysis Agent (MCP Gateway)</w:t>
+      </w:r>
+      <w:r>
+        <w:t xml:space="preserve">. Its MCP Client Tool </w:t>
+      </w:r>
+      <w:r>
+        <w:rPr>
+          <w:b/>
+        </w:rPr>
+        <w:t>MCP Gateway</w:t>
+      </w:r>
+      <w:r>
+        <w:t xml:space="preserve"> selects the same 12 tools under </w:t>
+      </w:r>
+      <w:r>
+        <w:rPr>
+          <w:b/>
+        </w:rPr>
+        <w:t>Tools to Include</w:t>
+      </w:r>
+      <w:r>
+        <w:t xml:space="preserve"> and uses the credential </w:t>
+      </w:r>
+      <w:r>
+        <w:rPr>
+          <w:b/>
+        </w:rPr>
+        <w:t>MCP Gateway Bearer</w:t>
+      </w:r>
+      <w:r>
+        <w:t xml:space="preserve">. The tool calls appear as </w:t>
+      </w:r>
+      <w:r>
+        <w:rPr>
+          <w:rFonts w:ascii="Courier New" w:hAnsi="Courier New"/>
+        </w:rPr>
+        <w:t>MCP_Gateway_check_initialization_status</w:t>
+      </w:r>
+    </w:p>
+    <w:p>
+      <w:r>
+        <w:t xml:space="preserve">The chat trigger also has a public </w:t>
+      </w:r>
+      <w:r>
+        <w:rPr>
+          <w:b/>
+        </w:rPr>
+        <w:t>Chat URL</w:t>
+      </w:r>
+      <w:r>
+        <w:t xml:space="preserve"> (it ends in </w:t>
+      </w:r>
+      <w:r>
+        <w:rPr>
+          <w:rFonts w:ascii="Courier New" w:hAnsi="Courier New"/>
+        </w:rPr>
+        <w:t>/webhook/&lt;id&gt;/chat</w:t>
+      </w:r>
+      <w:r>
+        <w:t xml:space="preserve">). That page asks for HTTP Basic authentication: the lab admin email and password (credential </w:t>
+      </w:r>
+      <w:r>
+        <w:rPr>
+          <w:b/>
+        </w:rPr>
+        <w:t>Lab Agents Chat</w:t>
+      </w:r>
+      <w:r>
+        <w:t>).</w:t>
+      </w:r>
+    </w:p>
+    <w:p>
+      <w:pPr>
+        <w:pStyle w:val="Heading3"/>
+      </w:pPr>
+      <w:r>
+        <w:t>Flowise</w:t>
+      </w:r>
+    </w:p>
+    <w:p>
+      <w:pPr>
+        <w:pStyle w:val="ListNumber"/>
+      </w:pPr>
+      <w:r>
+        <w:t xml:space="preserve">Sign in to Flowise, open </w:t>
+      </w:r>
+      <w:r>
+        <w:rPr>
+          <w:b/>
+        </w:rPr>
+        <w:t>Chatflows</w:t>
+      </w:r>
+      <w:r>
+        <w:t xml:space="preserve">, and open </w:t>
+      </w:r>
+      <w:r>
+        <w:rPr>
+          <w:b/>
+        </w:rPr>
+        <w:t>CPInfo Analysis Agent (Direct)</w:t>
+      </w:r>
+      <w:r>
+        <w:t xml:space="preserve"> or </w:t>
+      </w:r>
+      <w:r>
+        <w:rPr>
+          <w:b/>
+        </w:rPr>
+        <w:t>CPInfo Analysis Agent (MCP Gateway)</w:t>
+      </w:r>
+    </w:p>
+    <w:p>
+      <w:pPr>
+        <w:pStyle w:val="ListNumber"/>
+      </w:pPr>
+      <w:r>
+        <w:t>Click the chat icon at the top right of the canvas and send a prompt</w:t>
+      </w:r>
+    </w:p>
+    <w:p>
+      <w:pPr>
+        <w:pStyle w:val="ListNumber"/>
+      </w:pPr>
+      <w:r>
+        <w:t xml:space="preserve">The </w:t>
+      </w:r>
+      <w:r>
+        <w:rPr>
+          <w:b/>
+        </w:rPr>
+        <w:t>Custom MCP</w:t>
+      </w:r>
+      <w:r>
+        <w:t xml:space="preserve"> node shows the endpoint under </w:t>
+      </w:r>
+      <w:r>
+        <w:rPr>
+          <w:b/>
+        </w:rPr>
+        <w:t>MCP Server Config</w:t>
+      </w:r>
+      <w:r>
+        <w:t xml:space="preserve"> and the 12 selected tools under </w:t>
+      </w:r>
+      <w:r>
+        <w:rPr>
+          <w:b/>
+        </w:rPr>
+        <w:t>Available Actions</w:t>
+      </w:r>
+      <w:r>
+        <w:t xml:space="preserve">. The gateway agent sends </w:t>
+      </w:r>
+      <w:r>
+        <w:rPr>
+          <w:rFonts w:ascii="Courier New" w:hAnsi="Courier New"/>
+        </w:rPr>
+        <w:t>Authorization: Bearer {{$vars.MCP_GATEWAY_TOKEN}}</w:t>
+      </w:r>
+      <w:r>
+        <w:t xml:space="preserve">, the Flowise variable that </w:t>
+      </w:r>
+      <w:r>
+        <w:rPr>
+          <w:rFonts w:ascii="Courier New" w:hAnsi="Courier New"/>
+        </w:rPr>
+        <w:t>builders-import</w:t>
+      </w:r>
+      <w:r>
+        <w:t xml:space="preserve"> keeps in sync with </w:t>
+      </w:r>
+      <w:r>
+        <w:rPr>
+          <w:rFonts w:ascii="Courier New" w:hAnsi="Courier New"/>
+        </w:rPr>
+        <w:t>.env</w:t>
+      </w:r>
+    </w:p>
+    <w:p>
+      <w:pPr>
+        <w:pStyle w:val="Heading3"/>
+      </w:pPr>
+      <w:r>
+        <w:t>Langflow (Complete lab)</w:t>
+      </w:r>
+    </w:p>
+    <w:p>
+      <w:r>
+        <w:t>Langflow runs in the Complete lab (</w:t>
+      </w:r>
+      <w:r>
+        <w:rPr>
+          <w:rFonts w:ascii="Courier New" w:hAnsi="Courier New"/>
+        </w:rPr>
+        <w:t>COMPOSE_PROFILES=complete</w:t>
+      </w:r>
+      <w:r>
+        <w:t xml:space="preserve">), or on its own with the </w:t>
+      </w:r>
+      <w:r>
+        <w:rPr>
+          <w:rFonts w:ascii="Courier New" w:hAnsi="Courier New"/>
+        </w:rPr>
+        <w:t>langflow</w:t>
+      </w:r>
+      <w:r>
+        <w:t xml:space="preserve"> profile.</w:t>
+      </w:r>
+    </w:p>
+    <w:p>
+      <w:pPr>
+        <w:pStyle w:val="ListNumber"/>
+      </w:pPr>
+      <w:r>
+        <w:t xml:space="preserve">Sign in to Langflow and open the flow </w:t>
+      </w:r>
+      <w:r>
+        <w:rPr>
+          <w:b/>
+        </w:rPr>
+        <w:t>CPInfo Analysis Agent (Direct)</w:t>
+      </w:r>
+      <w:r>
+        <w:t xml:space="preserve"> or </w:t>
+      </w:r>
+      <w:r>
+        <w:rPr>
+          <w:b/>
+        </w:rPr>
+        <w:t>CPInfo Analysis Agent (MCP Gateway)</w:t>
+      </w:r>
+    </w:p>
+    <w:p>
+      <w:pPr>
+        <w:pStyle w:val="ListNumber"/>
+      </w:pPr>
+      <w:r>
+        <w:t xml:space="preserve">Click </w:t>
+      </w:r>
+      <w:r>
+        <w:rPr>
+          <w:b/>
+        </w:rPr>
+        <w:t>Playground</w:t>
+      </w:r>
+      <w:r>
+        <w:t xml:space="preserve"> (Langflow's chat panel) and send a prompt</w:t>
+      </w:r>
+    </w:p>
+    <w:p>
+      <w:pPr>
+        <w:pStyle w:val="ListNumber"/>
+      </w:pPr>
+      <w:r>
+        <w:t xml:space="preserve">In the gateway flow, the </w:t>
+      </w:r>
+      <w:r>
+        <w:rPr>
+          <w:b/>
+        </w:rPr>
+        <w:t>MCP Tools</w:t>
+      </w:r>
+      <w:r>
+        <w:t xml:space="preserve"> node lists all 190 gateway tools under </w:t>
+      </w:r>
+      <w:r>
+        <w:rPr>
+          <w:b/>
+        </w:rPr>
+        <w:t>Actions</w:t>
+      </w:r>
+      <w:r>
+        <w:t>, with only this server's 12 switched on</w:t>
+      </w:r>
+    </w:p>
+    <w:p>
+      <w:pPr>
+        <w:pStyle w:val="Heading2"/>
+      </w:pPr>
+      <w:r>
+        <w:t>Try these</w:t>
       </w:r>
     </w:p>
     <w:p>
@@ -57,7 +1069,10 @@
         <w:pStyle w:val="ListBullet"/>
       </w:pPr>
       <w:r>
-        <w:t xml:space="preserve">  **Postgres**: For chat memory.</w:t>
+        <w:rPr>
+          <w:i/>
+        </w:rPr>
+        <w:t>Which CPInfo files are loaded?</w:t>
       </w:r>
     </w:p>
     <w:p>
@@ -65,7 +1080,10 @@
         <w:pStyle w:val="ListBullet"/>
       </w:pPr>
       <w:r>
-        <w:t xml:space="preserve">  **OpenAI / Azure OpenAI / Ollama**: For the LLM.</w:t>
+        <w:rPr>
+          <w:i/>
+        </w:rPr>
+        <w:t>Summarize the health of the loaded CPInfo file</w:t>
       </w:r>
     </w:p>
     <w:p>
@@ -73,7 +1091,21 @@
         <w:pStyle w:val="ListBullet"/>
       </w:pPr>
       <w:r>
-        <w:t xml:space="preserve">  **MCP Client**: HTTP connection to the CPInfo Analysis MCP server.</w:t>
+        <w:rPr>
+          <w:i/>
+        </w:rPr>
+        <w:t>Analyze &lt;file name&gt; and list the installed licenses</w:t>
+      </w:r>
+    </w:p>
+    <w:p>
+      <w:pPr>
+        <w:pStyle w:val="ListBullet"/>
+      </w:pPr>
+      <w:r>
+        <w:rPr>
+          <w:i/>
+        </w:rPr>
+        <w:t>Did the system crash? Show the evidence</w:t>
       </w:r>
     </w:p>
     <w:p>
@@ -81,81 +1113,31 @@
         <w:pStyle w:val="Heading2"/>
       </w:pPr>
       <w:r>
-        <w:t>Step-by-Step Guide</w:t>
+        <w:t>Expected result</w:t>
       </w:r>
     </w:p>
     <w:p>
-      <w:pPr>
-        <w:pStyle w:val="Heading3"/>
-      </w:pPr>
-      <w:r>
-        <w:t>1. Open the Workflow</w:t>
+      <w:r>
+        <w:t>The agent checks which files are loaded (</w:t>
+      </w:r>
+      <w:r>
+        <w:rPr>
+          <w:rFonts w:ascii="Courier New" w:hAnsi="Courier New"/>
+        </w:rPr>
+        <w:t>check_initialization_status</w:t>
+      </w:r>
+      <w:r>
+        <w:t>), then runs the analysis tools:</w:t>
       </w:r>
     </w:p>
     <w:p>
-      <w:pPr>
-        <w:pStyle w:val="ListNumber"/>
-      </w:pPr>
-      <w:r>
-        <w:t xml:space="preserve"> Log in to n8n.</w:t>
+      <w:r>
+        <w:t>an overview, a health analysis, license and network details, or a search in the file's sections.</w:t>
       </w:r>
     </w:p>
     <w:p>
-      <w:pPr>
-        <w:pStyle w:val="ListNumber"/>
-      </w:pPr>
-      <w:r>
-        <w:t xml:space="preserve"> Locate and click on the **cp-cpinfo-analysis-mcp-agent** workflow.</w:t>
-      </w:r>
-    </w:p>
-    <w:p>
-      <w:pPr>
-        <w:pStyle w:val="Heading3"/>
-      </w:pPr>
-      <w:r>
-        <w:t>2. Using the Chat Interface</w:t>
-      </w:r>
-    </w:p>
-    <w:p>
-      <w:pPr>
-        <w:pStyle w:val="ListNumber"/>
-      </w:pPr>
-      <w:r>
-        <w:t xml:space="preserve"> Click the **Test Workflow** button.</w:t>
-      </w:r>
-    </w:p>
-    <w:p>
-      <w:pPr>
-        <w:pStyle w:val="ListNumber"/>
-      </w:pPr>
-      <w:r>
-        <w:t xml:space="preserve"> Click the **Chat** button.</w:t>
-      </w:r>
-    </w:p>
-    <w:p>
-      <w:pPr>
-        <w:pStyle w:val="ListNumber"/>
-      </w:pPr>
-      <w:r>
-        <w:t xml:space="preserve"> Enter a request, for example:</w:t>
-      </w:r>
-    </w:p>
-    <w:p>
-      <w:r>
-        <w:t xml:space="preserve">    &gt; "Analyze the file SMS_3_11_2025_11_17.info under /data/cpinfo/"</w:t>
-      </w:r>
-    </w:p>
-    <w:p>
-      <w:pPr>
-        <w:pStyle w:val="Heading3"/>
-      </w:pPr>
-      <w:r>
-        <w:t>3. Review Results</w:t>
-      </w:r>
-    </w:p>
-    <w:p>
-      <w:r>
-        <w:t>The AI agent will use the MCP tools to analyze the specified file and return a summary of the findings.</w:t>
+      <w:r>
+        <w:t>Expect a short summary with the findings that need attention and the next steps.</w:t>
       </w:r>
     </w:p>
     <w:p>
@@ -163,151 +1145,426 @@
         <w:pStyle w:val="Heading2"/>
       </w:pPr>
       <w:r>
-        <w:t>Workflow Deep Dive</w:t>
+        <w:t>How the agents are built</w:t>
       </w:r>
     </w:p>
     <w:p>
-      <w:pPr>
-        <w:pStyle w:val="Heading3"/>
-      </w:pPr>
-      <w:r>
-        <w:t>1. Input Trigger: Chat Interface</w:t>
+      <w:r>
+        <w:t>| n8n node | Type | What it does |</w:t>
       </w:r>
     </w:p>
     <w:p>
-      <w:pPr>
-        <w:pStyle w:val="ListBullet"/>
-      </w:pPr>
-      <w:r>
-        <w:t xml:space="preserve">  **Node Name**: `When chat message received`</w:t>
+      <w:r>
+        <w:t xml:space="preserve">| </w:t>
+      </w:r>
+      <w:r>
+        <w:rPr>
+          <w:rFonts w:ascii="Courier New" w:hAnsi="Courier New"/>
+        </w:rPr>
+        <w:t>When chat message received</w:t>
+      </w:r>
+      <w:r>
+        <w:t xml:space="preserve"> | Chat Trigger | Starts one run per message. Shows the greeting and starter prompts. Public chat behind HTTP Basic authentication (credential </w:t>
+      </w:r>
+      <w:r>
+        <w:rPr>
+          <w:b/>
+        </w:rPr>
+        <w:t>Lab Agents Chat</w:t>
+      </w:r>
+      <w:r>
+        <w:t>) |</w:t>
       </w:r>
     </w:p>
     <w:p>
-      <w:pPr>
-        <w:pStyle w:val="ListBullet"/>
-      </w:pPr>
-      <w:r>
-        <w:t xml:space="preserve">  **Purpose**: Initiates the workflow when a user sends a message.</w:t>
+      <w:r>
+        <w:t xml:space="preserve">| </w:t>
+      </w:r>
+      <w:r>
+        <w:rPr>
+          <w:rFonts w:ascii="Courier New" w:hAnsi="Courier New"/>
+        </w:rPr>
+        <w:t>Normalize input</w:t>
+      </w:r>
+      <w:r>
+        <w:t xml:space="preserve"> | Edit Fields | Takes </w:t>
+      </w:r>
+      <w:r>
+        <w:rPr>
+          <w:rFonts w:ascii="Courier New" w:hAnsi="Courier New"/>
+        </w:rPr>
+        <w:t>chatInput</w:t>
+      </w:r>
+      <w:r>
+        <w:t xml:space="preserve"> and </w:t>
+      </w:r>
+      <w:r>
+        <w:rPr>
+          <w:rFonts w:ascii="Courier New" w:hAnsi="Courier New"/>
+        </w:rPr>
+        <w:t>sessionId</w:t>
+      </w:r>
+      <w:r>
+        <w:t xml:space="preserve"> from the chat, or from the body of a webhook call |</w:t>
       </w:r>
     </w:p>
     <w:p>
-      <w:pPr>
-        <w:pStyle w:val="Heading3"/>
-      </w:pPr>
-      <w:r>
-        <w:t>2. The Brain: AI Agent</w:t>
+      <w:r>
+        <w:t xml:space="preserve">| </w:t>
+      </w:r>
+      <w:r>
+        <w:rPr>
+          <w:rFonts w:ascii="Courier New" w:hAnsi="Courier New"/>
+        </w:rPr>
+        <w:t>CPInfo Analysis Agent</w:t>
+      </w:r>
+      <w:r>
+        <w:t xml:space="preserve"> | AI Agent | Holds the system prompt and decides which tools to call. On an error it continues to </w:t>
+      </w:r>
+      <w:r>
+        <w:rPr>
+          <w:rFonts w:ascii="Courier New" w:hAnsi="Courier New"/>
+        </w:rPr>
+        <w:t>Friendly error</w:t>
+      </w:r>
+      <w:r>
+        <w:t xml:space="preserve"> |</w:t>
       </w:r>
     </w:p>
     <w:p>
-      <w:pPr>
-        <w:pStyle w:val="ListBullet"/>
-      </w:pPr>
-      <w:r>
-        <w:t xml:space="preserve">  **Node Name**: `CP CPinfo Analysis AI Agent`</w:t>
+      <w:r>
+        <w:t xml:space="preserve">| </w:t>
+      </w:r>
+      <w:r>
+        <w:rPr>
+          <w:rFonts w:ascii="Courier New" w:hAnsi="Courier New"/>
+        </w:rPr>
+        <w:t>OpenAI Chat Model</w:t>
+      </w:r>
+      <w:r>
+        <w:t xml:space="preserve"> | OpenAI Chat Model | Model </w:t>
+      </w:r>
+      <w:r>
+        <w:rPr>
+          <w:rFonts w:ascii="Courier New" w:hAnsi="Courier New"/>
+        </w:rPr>
+        <w:t>lab-chat</w:t>
+      </w:r>
+      <w:r>
+        <w:t xml:space="preserve"> with the credential </w:t>
+      </w:r>
+      <w:r>
+        <w:rPr>
+          <w:b/>
+        </w:rPr>
+        <w:t>Lab Model (LiteLLM)</w:t>
+      </w:r>
+      <w:r>
+        <w:t xml:space="preserve"> (</w:t>
+      </w:r>
+      <w:r>
+        <w:rPr>
+          <w:rFonts w:ascii="Courier New" w:hAnsi="Courier New"/>
+        </w:rPr>
+        <w:t>http://litellm:4000/v1</w:t>
+      </w:r>
+      <w:r>
+        <w:t>) |</w:t>
       </w:r>
     </w:p>
     <w:p>
-      <w:pPr>
-        <w:pStyle w:val="ListBullet"/>
-      </w:pPr>
-      <w:r>
-        <w:t xml:space="preserve">  **Type**: `@n8n/n8n-nodes-langchain.agent`</w:t>
+      <w:r>
+        <w:t xml:space="preserve">| </w:t>
+      </w:r>
+      <w:r>
+        <w:rPr>
+          <w:rFonts w:ascii="Courier New" w:hAnsi="Courier New"/>
+        </w:rPr>
+        <w:t>Conversation Memory</w:t>
+      </w:r>
+      <w:r>
+        <w:t xml:space="preserve"> | Simple Memory | Keeps the recent turns of the chat session |</w:t>
       </w:r>
     </w:p>
     <w:p>
-      <w:pPr>
-        <w:pStyle w:val="ListBullet"/>
-      </w:pPr>
-      <w:r>
-        <w:t xml:space="preserve">  **Purpose**: The central intelligence that parses user intent and orchestrates tool usage.</w:t>
+      <w:r>
+        <w:t xml:space="preserve">| </w:t>
+      </w:r>
+      <w:r>
+        <w:rPr>
+          <w:rFonts w:ascii="Courier New" w:hAnsi="Courier New"/>
+        </w:rPr>
+        <w:t>CPInfo Analysis MCP</w:t>
+      </w:r>
+      <w:r>
+        <w:t xml:space="preserve"> or </w:t>
+      </w:r>
+      <w:r>
+        <w:rPr>
+          <w:rFonts w:ascii="Courier New" w:hAnsi="Courier New"/>
+        </w:rPr>
+        <w:t>MCP Gateway</w:t>
+      </w:r>
+      <w:r>
+        <w:t xml:space="preserve"> | MCP Client Tool | The 12 tools: direct to </w:t>
+      </w:r>
+      <w:r>
+        <w:rPr>
+          <w:rFonts w:ascii="Courier New" w:hAnsi="Courier New"/>
+        </w:rPr>
+        <w:t>http://cpinfo-analysis-mcp:3012</w:t>
+      </w:r>
+      <w:r>
+        <w:t>, or through the gateway |</w:t>
       </w:r>
     </w:p>
     <w:p>
-      <w:pPr>
-        <w:pStyle w:val="ListBullet"/>
-      </w:pPr>
-      <w:r>
-        <w:t xml:space="preserve">  **Configuration**:</w:t>
+      <w:r>
+        <w:t xml:space="preserve">| </w:t>
+      </w:r>
+      <w:r>
+        <w:rPr>
+          <w:rFonts w:ascii="Courier New" w:hAnsi="Courier New"/>
+        </w:rPr>
+        <w:t>Friendly error</w:t>
+      </w:r>
+      <w:r>
+        <w:t xml:space="preserve"> | Code | Turns a failure into a plain explanation with the command that fixes it |</w:t>
       </w:r>
     </w:p>
     <w:p>
-      <w:pPr>
-        <w:pStyle w:val="ListBullet"/>
-      </w:pPr>
-      <w:r>
-        <w:t xml:space="preserve">  **System Message**: Instructs the AI to start by calling tools, show available tools, and then use the best tool to analyze the results.</w:t>
+      <w:r>
+        <w:t xml:space="preserve">In Flowise, a </w:t>
+      </w:r>
+      <w:r>
+        <w:rPr>
+          <w:b/>
+        </w:rPr>
+        <w:t>Tool Agent</w:t>
+      </w:r>
+      <w:r>
+        <w:t xml:space="preserve"> uses the </w:t>
+      </w:r>
+      <w:r>
+        <w:rPr>
+          <w:b/>
+        </w:rPr>
+        <w:t>OpenAI</w:t>
+      </w:r>
+      <w:r>
+        <w:t xml:space="preserve"> chat model node (</w:t>
+      </w:r>
+      <w:r>
+        <w:rPr>
+          <w:rFonts w:ascii="Courier New" w:hAnsi="Courier New"/>
+        </w:rPr>
+        <w:t>lab-chat</w:t>
+      </w:r>
+      <w:r>
+        <w:t xml:space="preserve">, credential </w:t>
+      </w:r>
+      <w:r>
+        <w:rPr>
+          <w:b/>
+        </w:rPr>
+        <w:t>Lab Model (LiteLLM)</w:t>
+      </w:r>
+      <w:r>
+        <w:t xml:space="preserve">, Base Path </w:t>
+      </w:r>
+      <w:r>
+        <w:rPr>
+          <w:rFonts w:ascii="Courier New" w:hAnsi="Courier New"/>
+        </w:rPr>
+        <w:t>http://litellm:4000/v1</w:t>
+      </w:r>
+      <w:r>
+        <w:t xml:space="preserve">), </w:t>
+      </w:r>
+      <w:r>
+        <w:rPr>
+          <w:b/>
+        </w:rPr>
+        <w:t>Buffer Memory</w:t>
+      </w:r>
+      <w:r>
+        <w:t xml:space="preserve">, and one </w:t>
+      </w:r>
+      <w:r>
+        <w:rPr>
+          <w:b/>
+        </w:rPr>
+        <w:t>Custom MCP</w:t>
+      </w:r>
+      <w:r>
+        <w:t xml:space="preserve"> node. In Langflow, </w:t>
+      </w:r>
+      <w:r>
+        <w:rPr>
+          <w:b/>
+        </w:rPr>
+        <w:t>Chat Input</w:t>
+      </w:r>
+      <w:r>
+        <w:t xml:space="preserve"> feeds an </w:t>
+      </w:r>
+      <w:r>
+        <w:rPr>
+          <w:b/>
+        </w:rPr>
+        <w:t>Agent</w:t>
+      </w:r>
+      <w:r>
+        <w:t xml:space="preserve"> with the </w:t>
+      </w:r>
+      <w:r>
+        <w:rPr>
+          <w:b/>
+        </w:rPr>
+        <w:t>OpenAI</w:t>
+      </w:r>
+      <w:r>
+        <w:t xml:space="preserve"> component (</w:t>
+      </w:r>
+      <w:r>
+        <w:rPr>
+          <w:rFonts w:ascii="Courier New" w:hAnsi="Courier New"/>
+        </w:rPr>
+        <w:t>lab-chat</w:t>
+      </w:r>
+      <w:r>
+        <w:t xml:space="preserve">, OpenAI API Base </w:t>
+      </w:r>
+      <w:r>
+        <w:rPr>
+          <w:rFonts w:ascii="Courier New" w:hAnsi="Courier New"/>
+        </w:rPr>
+        <w:t>http://litellm:4000/v1</w:t>
+      </w:r>
+      <w:r>
+        <w:t xml:space="preserve">, API key from the global variable </w:t>
+      </w:r>
+      <w:r>
+        <w:rPr>
+          <w:rFonts w:ascii="Courier New" w:hAnsi="Courier New"/>
+        </w:rPr>
+        <w:t>LITELLM_MASTER_KEY</w:t>
+      </w:r>
+      <w:r>
+        <w:t xml:space="preserve">) and one </w:t>
+      </w:r>
+      <w:r>
+        <w:rPr>
+          <w:b/>
+        </w:rPr>
+        <w:t>MCP Tools</w:t>
+      </w:r>
+      <w:r>
+        <w:t xml:space="preserve"> node, and the answer goes to </w:t>
+      </w:r>
+      <w:r>
+        <w:rPr>
+          <w:b/>
+        </w:rPr>
+        <w:t>Chat Output</w:t>
+      </w:r>
+      <w:r>
+        <w:t xml:space="preserve">. For a node-by-node walkthrough, see the </w:t>
+      </w:r>
+      <w:r>
+        <w:t>Threat Prevention deep dive</w:t>
+      </w:r>
+      <w:r>
+        <w:t xml:space="preserve"> (CheckPoint_Threat_Prevention_Guide.md)</w:t>
+      </w:r>
+      <w:r>
+        <w:t>.</w:t>
       </w:r>
     </w:p>
     <w:p>
-      <w:pPr>
-        <w:pStyle w:val="Heading3"/>
-      </w:pPr>
-      <w:r>
-        <w:t>3. Memory Management</w:t>
+      <w:r>
+        <w:rPr>
+          <w:b/>
+        </w:rPr>
+        <w:t>Updates.</w:t>
+      </w:r>
+      <w:r>
+        <w:t xml:space="preserve"> </w:t>
+      </w:r>
+      <w:r>
+        <w:rPr>
+          <w:rFonts w:ascii="Courier New" w:hAnsi="Courier New"/>
+        </w:rPr>
+        <w:t>n8n-import</w:t>
+      </w:r>
+      <w:r>
+        <w:t xml:space="preserve"> and </w:t>
+      </w:r>
+      <w:r>
+        <w:rPr>
+          <w:rFonts w:ascii="Courier New" w:hAnsi="Courier New"/>
+        </w:rPr>
+        <w:t>builders-import</w:t>
+      </w:r>
+      <w:r>
+        <w:t xml:space="preserve"> re-import these agents on every deploy and keep an agent you changed. To keep your own variant, duplicate it first. </w:t>
+      </w:r>
+      <w:r>
+        <w:rPr>
+          <w:rFonts w:ascii="Courier New" w:hAnsi="Courier New"/>
+        </w:rPr>
+        <w:t>N8N_SEED_OVERWRITE=1</w:t>
+      </w:r>
+      <w:r>
+        <w:t xml:space="preserve"> (n8n) or </w:t>
+      </w:r>
+      <w:r>
+        <w:rPr>
+          <w:rFonts w:ascii="Courier New" w:hAnsi="Courier New"/>
+        </w:rPr>
+        <w:t>SEED_OVERWRITE=1</w:t>
+      </w:r>
+      <w:r>
+        <w:t xml:space="preserve"> (Flowise and Langflow) replaces a changed agent with the repository version; set it back to </w:t>
+      </w:r>
+      <w:r>
+        <w:rPr>
+          <w:rFonts w:ascii="Courier New" w:hAnsi="Courier New"/>
+        </w:rPr>
+        <w:t>0</w:t>
+      </w:r>
+      <w:r>
+        <w:t xml:space="preserve"> after that run.</w:t>
       </w:r>
     </w:p>
     <w:p>
-      <w:pPr>
-        <w:pStyle w:val="ListBullet"/>
-      </w:pPr>
-      <w:r>
-        <w:t xml:space="preserve">  **Node Name**: `Postgres Chat Memory`</w:t>
+      <w:r>
+        <w:rPr>
+          <w:b/>
+        </w:rPr>
+        <w:t>Data handling.</w:t>
+      </w:r>
+      <w:r>
+        <w:t xml:space="preserve"> CPInfo files hold the full configuration of a system. A CPInfo file from a customer system is</w:t>
       </w:r>
     </w:p>
     <w:p>
-      <w:pPr>
-        <w:pStyle w:val="ListBullet"/>
-      </w:pPr>
-      <w:r>
-        <w:t xml:space="preserve">  **Purpose**: Stores conversation history for context-aware interactions.</w:t>
+      <w:r>
+        <w:t xml:space="preserve">confidential customer data. Every tool result goes to the model provider behind </w:t>
+      </w:r>
+      <w:r>
+        <w:rPr>
+          <w:rFonts w:ascii="Courier New" w:hAnsi="Courier New"/>
+        </w:rPr>
+        <w:t>lab-chat</w:t>
+      </w:r>
+      <w:r>
+        <w:t>, which may</w:t>
       </w:r>
     </w:p>
     <w:p>
-      <w:pPr>
-        <w:pStyle w:val="Heading3"/>
-      </w:pPr>
-      <w:r>
-        <w:t>4. The Tools: MCP Client</w:t>
-      </w:r>
-    </w:p>
-    <w:p>
-      <w:pPr>
-        <w:pStyle w:val="ListBullet"/>
-      </w:pPr>
-      <w:r>
-        <w:t xml:space="preserve">  **Nodes**: `List-CP-MCP-Tools` and `Execute-CP-MCP-Tools`</w:t>
-      </w:r>
-    </w:p>
-    <w:p>
-      <w:pPr>
-        <w:pStyle w:val="ListBullet"/>
-      </w:pPr>
-      <w:r>
-        <w:t xml:space="preserve">  **Purpose**: Bridges the AI agent with the Check Point CPInfo Analysis tools via MCP.</w:t>
-      </w:r>
-    </w:p>
-    <w:p>
-      <w:pPr>
-        <w:pStyle w:val="ListBullet"/>
-      </w:pPr>
-      <w:r>
-        <w:t xml:space="preserve">  **Functionality**:</w:t>
-      </w:r>
-    </w:p>
-    <w:p>
-      <w:pPr>
-        <w:pStyle w:val="ListBullet"/>
-      </w:pPr>
-      <w:r>
-        <w:t xml:space="preserve">  **List**: Retrieves available analysis tools.</w:t>
-      </w:r>
-    </w:p>
-    <w:p>
-      <w:pPr>
-        <w:pStyle w:val="ListBullet"/>
-      </w:pPr>
-      <w:r>
-        <w:t xml:space="preserve">  **Execute**: Runs the selected tool with parameters derived by the AI.</w:t>
+      <w:r>
+        <w:t>be an external service. Use CPInfo files from lab systems only.</w:t>
       </w:r>
     </w:p>
     <w:p>
@@ -315,23 +1572,203 @@
         <w:pStyle w:val="Heading2"/>
       </w:pPr>
       <w:r>
-        <w:t>Best Practices</w:t>
+        <w:t>Troubleshooting</w:t>
       </w:r>
     </w:p>
     <w:p>
-      <w:pPr>
-        <w:pStyle w:val="ListBullet"/>
-      </w:pPr>
-      <w:r>
-        <w:t xml:space="preserve">  **Specific Filenames**: Provide exact filenames and paths for accurate analysis.</w:t>
+      <w:r>
+        <w:t>| Symptom | Cause | Fix |</w:t>
       </w:r>
     </w:p>
     <w:p>
-      <w:pPr>
-        <w:pStyle w:val="ListBullet"/>
-      </w:pPr>
-      <w:r>
-        <w:t xml:space="preserve">  **Context**: The agent has memory, so you can ask follow-up questions about the analysis results.</w:t>
+      <w:r>
+        <w:t xml:space="preserve">| </w:t>
+      </w:r>
+      <w:r>
+        <w:rPr>
+          <w:rFonts w:ascii="Courier New" w:hAnsi="Courier New"/>
+        </w:rPr>
+        <w:t>Access denied: &lt;path&gt; is not a file under the allowed cpinfo directories (/data/cpinfo)</w:t>
+      </w:r>
+      <w:r>
+        <w:t xml:space="preserve"> | The file is outside </w:t>
+      </w:r>
+      <w:r>
+        <w:rPr>
+          <w:rFonts w:ascii="Courier New" w:hAnsi="Courier New"/>
+        </w:rPr>
+        <w:t>n8n/shared</w:t>
+      </w:r>
+      <w:r>
+        <w:t xml:space="preserve">, or is not a regular file | Copy the file into </w:t>
+      </w:r>
+      <w:r>
+        <w:rPr>
+          <w:rFonts w:ascii="Courier New" w:hAnsi="Courier New"/>
+        </w:rPr>
+        <w:t>n8n/shared</w:t>
+      </w:r>
+      <w:r>
+        <w:t xml:space="preserve"> and use its name |</w:t>
+      </w:r>
+    </w:p>
+    <w:p>
+      <w:r>
+        <w:t xml:space="preserve">| The MCP Gateway agent answers with HTTP 401 | The token in the builder differs from </w:t>
+      </w:r>
+      <w:r>
+        <w:rPr>
+          <w:rFonts w:ascii="Courier New" w:hAnsi="Courier New"/>
+        </w:rPr>
+        <w:t>MCP_GATEWAY_TOKEN</w:t>
+      </w:r>
+      <w:r>
+        <w:t xml:space="preserve"> in </w:t>
+      </w:r>
+      <w:r>
+        <w:rPr>
+          <w:rFonts w:ascii="Courier New" w:hAnsi="Courier New"/>
+        </w:rPr>
+        <w:t>.env</w:t>
+      </w:r>
+      <w:r>
+        <w:t xml:space="preserve"> | n8n: </w:t>
+      </w:r>
+      <w:r>
+        <w:rPr>
+          <w:rFonts w:ascii="Courier New" w:hAnsi="Courier New"/>
+        </w:rPr>
+        <w:t>docker compose run --rm n8n-import</w:t>
+      </w:r>
+      <w:r>
+        <w:t xml:space="preserve">. Flowise and Langflow: </w:t>
+      </w:r>
+      <w:r>
+        <w:rPr>
+          <w:rFonts w:ascii="Courier New" w:hAnsi="Courier New"/>
+        </w:rPr>
+        <w:t>docker compose run --rm builders-import</w:t>
+      </w:r>
+      <w:r>
+        <w:t xml:space="preserve"> |</w:t>
+      </w:r>
+    </w:p>
+    <w:p>
+      <w:r>
+        <w:t xml:space="preserve">| The MCP Gateway agent has no tools, or fails while the Direct agent works | The gateway started before the server was ready, or still uses sessions to an old server container | </w:t>
+      </w:r>
+      <w:r>
+        <w:rPr>
+          <w:rFonts w:ascii="Courier New" w:hAnsi="Courier New"/>
+        </w:rPr>
+        <w:t>docker compose restart mcp-gateway</w:t>
+      </w:r>
+      <w:r>
+        <w:t xml:space="preserve"> |</w:t>
+      </w:r>
+    </w:p>
+    <w:p>
+      <w:r>
+        <w:t xml:space="preserve">| </w:t>
+      </w:r>
+      <w:r>
+        <w:rPr>
+          <w:b/>
+        </w:rPr>
+        <w:t>Friendly error</w:t>
+      </w:r>
+      <w:r>
+        <w:t xml:space="preserve">: the lab model endpoint is not reachable | LiteLLM is not running | </w:t>
+      </w:r>
+      <w:r>
+        <w:rPr>
+          <w:rFonts w:ascii="Courier New" w:hAnsi="Courier New"/>
+        </w:rPr>
+        <w:t>docker compose up -d litellm</w:t>
+      </w:r>
+      <w:r>
+        <w:t xml:space="preserve"> |</w:t>
+      </w:r>
+    </w:p>
+    <w:p>
+      <w:r>
+        <w:t xml:space="preserve">| </w:t>
+      </w:r>
+      <w:r>
+        <w:rPr>
+          <w:b/>
+        </w:rPr>
+        <w:t>Friendly error</w:t>
+      </w:r>
+      <w:r>
+        <w:t xml:space="preserve">: LiteLLM could not serve the </w:t>
+      </w:r>
+      <w:r>
+        <w:rPr>
+          <w:rFonts w:ascii="Courier New" w:hAnsi="Courier New"/>
+        </w:rPr>
+        <w:t>lab-chat</w:t>
+      </w:r>
+      <w:r>
+        <w:t xml:space="preserve"> model | No working model provider key, or the provider failed | Check the key in </w:t>
+      </w:r>
+      <w:r>
+        <w:rPr>
+          <w:rFonts w:ascii="Courier New" w:hAnsi="Courier New"/>
+        </w:rPr>
+        <w:t>.env</w:t>
+      </w:r>
+      <w:r>
+        <w:t xml:space="preserve">, then </w:t>
+      </w:r>
+      <w:r>
+        <w:rPr>
+          <w:rFonts w:ascii="Courier New" w:hAnsi="Courier New"/>
+        </w:rPr>
+        <w:t>docker compose logs litellm</w:t>
+      </w:r>
+      <w:r>
+        <w:t xml:space="preserve"> |</w:t>
+      </w:r>
+    </w:p>
+    <w:p>
+      <w:r>
+        <w:t>| The hosted chat URL asks for a password | HTTP Basic authentication on the chat trigger | Sign in with the lab admin email and password |</w:t>
+      </w:r>
+    </w:p>
+    <w:p>
+      <w:r>
+        <w:rPr>
+          <w:i/>
+        </w:rPr>
+        <w:t>Related:</w:t>
+      </w:r>
+      <w:r>
+        <w:t xml:space="preserve"> </w:t>
+      </w:r>
+      <w:r>
+        <w:t>The MCP Gateway, Explained</w:t>
+      </w:r>
+      <w:r>
+        <w:t xml:space="preserve"> (MCP_Gateway_Explained.md)</w:t>
+      </w:r>
+      <w:r>
+        <w:t xml:space="preserve"> · </w:t>
+      </w:r>
+      <w:r>
+        <w:t>Direct and MCP Gateway agents lab</w:t>
+      </w:r>
+      <w:r>
+        <w:t xml:space="preserve"> (MCP_Gateway_Agent_Guide.md)</w:t>
+      </w:r>
+      <w:r>
+        <w:t xml:space="preserve"> · </w:t>
+      </w:r>
+      <w:r>
+        <w:t>Gateway CLI</w:t>
+      </w:r>
+      <w:r>
+        <w:t xml:space="preserve"> (Quantum_Gateway_CLI_MCP_Agent_Guide.md)</w:t>
       </w:r>
     </w:p>
     <w:sectPr>

</xml_diff>